<commit_message>
Note d'installation : montage d'un dépôt local sous Docker Desktop Windows (installation en conteneur testée)
Combinaison B1 testée : démo injectée par installation-demo dans la base en conteneur, TraceAgile et
serveur d'exécution construits depuis les jars, appairage, Playwright installé depuis le serveur,
run réel CMP-2 (3 réussis, 1 échec attendu), artefacts relus, redémarrage sans perte.

Co-Authored-By: Claude Opus 5.5 <noreply@anthropic.com>
</commit_message>
<xml_diff>
--- a/docs/installation-traceagile.docx
+++ b/docs/installation-traceagile.docx
@@ -5284,7 +5284,7 @@
       <w:r>
         <w:t xml:space="preserve"> (application Swag Labs, </w:t>
       </w:r>
-      <w:hyperlink w:history="1" r:id="rIddwub40bhpleruutyelhnc">
+      <w:hyperlink w:history="1" r:id="rIdbggc2xk5_thvzla3qu_lw">
         <w:r>
           <w:rPr>
             <w:color w:val="19647E"/>
@@ -7058,7 +7058,7 @@
       <w:r>
         <w:t xml:space="preserve"> Le plus simple est </w:t>
       </w:r>
-      <w:hyperlink w:history="1" r:id="rIdxqdrralkcoeifymizodab">
+      <w:hyperlink w:history="1" r:id="rIdsdd7lt3v0cnckghfyjbu6">
         <w:r>
           <w:rPr>
             <w:color w:val="19647E"/>
@@ -7071,7 +7071,7 @@
         <w:t xml:space="preserve"> ou
 </w:t>
       </w:r>
-      <w:hyperlink w:history="1" r:id="rIdeo_m1osaaldukju8hxbhj">
+      <w:hyperlink w:history="1" r:id="rIdgvuuums2ejevrnsxul5m6">
         <w:r>
           <w:rPr>
             <w:color w:val="19647E"/>
@@ -8905,6 +8905,10 @@
       <w:r>
         <w:t xml:space="preserve">      - /srv/depots:/depots:ro     # puis file:///depots/&lt;projet&gt; dans la fiche des tests</w:t>
       </w:r>
+      <w:r>
+        <w:br/>
+        <w:t xml:space="preserve">      # Docker Desktop sous Windows : - C:/Depots/projet:/depots/projet:ro</w:t>
+      </w:r>
     </w:p>
     <w:p>
       <w:pPr>
@@ -10799,19 +10803,7 @@
           </w:tcPr>
           <w:p>
             <w:r>
-              <w:t xml:space="preserve">Normal quand les deux logiciels sont en conteneur sur la même machine : le second rejoint le réseau créé par le premier. De même, </w:t>
-            </w:r>
-            <w:r>
-              <w:rPr>
-                <w:rFonts w:ascii="Consolas" w:cs="Consolas" w:eastAsia="Consolas" w:hAnsi="Consolas"/>
-                <w:sz w:val="19"/>
-                <w:szCs w:val="19"/>
-                <w:shd w:fill="E2EEF2" w:val="clear"/>
-              </w:rPr>
-              <w:t xml:space="preserve">docker compose down</w:t>
-            </w:r>
-            <w:r>
-              <w:t xml:space="preserve"> de l'un signale que le réseau est encore utilisé par l'autre.</w:t>
+              <w:t xml:space="preserve">Normal quand les deux logiciels sont en conteneur sur la même machine : le second rejoint le réseau créé par le premier.</w:t>
             </w:r>
           </w:p>
         </w:tc>

</xml_diff>

<commit_message>
Guide, note d'installation et démo SwagLabs : dépôts Git
Co-Authored-By: Claude Opus 5.5 <noreply@anthropic.com>
</commit_message>
<xml_diff>
--- a/docs/installation-traceagile.docx
+++ b/docs/installation-traceagile.docx
@@ -582,10 +582,28 @@
     </w:p>
     <w:p>
       <w:pPr>
+        <w:spacing w:after="20"/>
+        <w:ind w:left="400"/>
+      </w:pPr>
+      <w:hyperlink w:history="1" w:anchor="chap_25">
+        <w:r>
+          <w:rPr>
+            <w:b w:val="false"/>
+            <w:bCs w:val="false"/>
+            <w:color w:val="19647E"/>
+            <w:sz w:val="20"/>
+            <w:szCs w:val="20"/>
+          </w:rPr>
+          <w:t xml:space="preserve">9.3 Dépôts Git des tests</w:t>
+        </w:r>
+      </w:hyperlink>
+    </w:p>
+    <w:p>
+      <w:pPr>
         <w:spacing w:after="60"/>
         <w:ind w:left="0"/>
       </w:pPr>
-      <w:hyperlink w:history="1" w:anchor="chap_25">
+      <w:hyperlink w:history="1" w:anchor="chap_26">
         <w:r>
           <w:rPr>
             <w:b/>
@@ -603,7 +621,7 @@
         <w:spacing w:after="60"/>
         <w:ind w:left="0"/>
       </w:pPr>
-      <w:hyperlink w:history="1" w:anchor="chap_26">
+      <w:hyperlink w:history="1" w:anchor="chap_27">
         <w:r>
           <w:rPr>
             <w:b/>
@@ -621,7 +639,7 @@
         <w:spacing w:after="60"/>
         <w:ind w:left="0"/>
       </w:pPr>
-      <w:hyperlink w:history="1" w:anchor="chap_27">
+      <w:hyperlink w:history="1" w:anchor="chap_28">
         <w:r>
           <w:rPr>
             <w:b/>
@@ -639,7 +657,7 @@
         <w:spacing w:after="60"/>
         <w:ind w:left="0"/>
       </w:pPr>
-      <w:hyperlink w:history="1" w:anchor="chap_28">
+      <w:hyperlink w:history="1" w:anchor="chap_29">
         <w:r>
           <w:rPr>
             <w:b/>
@@ -657,7 +675,7 @@
         <w:spacing w:after="60"/>
         <w:ind w:left="0"/>
       </w:pPr>
-      <w:hyperlink w:history="1" w:anchor="chap_29">
+      <w:hyperlink w:history="1" w:anchor="chap_30">
         <w:r>
           <w:rPr>
             <w:b/>
@@ -5284,7 +5302,7 @@
       <w:r>
         <w:t xml:space="preserve"> (application Swag Labs, </w:t>
       </w:r>
-      <w:hyperlink w:history="1" r:id="rIdbggc2xk5_thvzla3qu_lw">
+      <w:hyperlink w:history="1" r:id="rIdsglxzajljygmd3ltjfunu">
         <w:r>
           <w:rPr>
             <w:color w:val="19647E"/>
@@ -7058,7 +7076,7 @@
       <w:r>
         <w:t xml:space="preserve"> Le plus simple est </w:t>
       </w:r>
-      <w:hyperlink w:history="1" r:id="rIdsdd7lt3v0cnckghfyjbu6">
+      <w:hyperlink w:history="1" r:id="rIdk41huofiys-rts9ufenmt">
         <w:r>
           <w:rPr>
             <w:color w:val="19647E"/>
@@ -7071,7 +7089,7 @@
         <w:t xml:space="preserve"> ou
 </w:t>
       </w:r>
-      <w:hyperlink w:history="1" r:id="rIdgvuuums2ejevrnsxul5m6">
+      <w:hyperlink w:history="1" r:id="rIdstbkzi4avcvne7ohqreq5">
         <w:r>
           <w:rPr>
             <w:color w:val="19647E"/>
@@ -9118,30 +9136,107 @@
       </w:r>
     </w:p>
     <w:p>
-      <w:r>
-        <w:t xml:space="preserve">Pour un dépôt Git privé, saisir les identifiants de son hôte dans la page </w:t>
+      <w:pPr>
+        <w:pStyle w:val="Heading2"/>
+      </w:pPr>
+      <w:bookmarkStart w:name="chap_25" w:id="1"/>
+      <w:r>
+        <w:t xml:space="preserve">9.3 Dépôts Git des tests</w:t>
+      </w:r>
+      <w:bookmarkEnd w:id="1"/>
+    </w:p>
+    <w:p>
+      <w:r>
+        <w:t xml:space="preserve">Les dépôts des tests automatisés se déclarent dans TraceAgile, </w:t>
       </w:r>
       <w:r>
         <w:rPr>
           <w:b/>
           <w:bCs/>
         </w:rPr>
-        <w:t xml:space="preserve">Paramètres</w:t>
-      </w:r>
-      <w:r>
-        <w:t xml:space="preserve"> du serveur
-d'exécution.</w:t>
-      </w:r>
-    </w:p>
-    <w:p>
-      <w:pPr>
-        <w:pStyle w:val="Heading1"/>
-      </w:pPr>
-      <w:bookmarkStart w:name="chap_25" w:id="1"/>
-      <w:r>
-        <w:t xml:space="preserve">10. Réseau et pare-feu</w:t>
-      </w:r>
-      <w:bookmarkEnd w:id="1"/>
+        <w:t xml:space="preserve">Administration › Dépôts Git</w:t>
+      </w:r>
+      <w:r>
+        <w:t xml:space="preserve"> :</w:t>
+      </w:r>
+    </w:p>
+    <w:p>
+      <w:pPr>
+        <w:pStyle w:val="ListParagraph"/>
+        <w:numPr>
+          <w:ilvl w:val="0"/>
+          <w:numId w:val="2"/>
+        </w:numPr>
+      </w:pPr>
+      <w:r>
+        <w:t xml:space="preserve">un dépôt est l'adresse d'un compte ou d'une organisation (</w:t>
+      </w:r>
+      <w:r>
+        <w:rPr>
+          <w:rFonts w:ascii="Consolas" w:cs="Consolas" w:eastAsia="Consolas" w:hAnsi="Consolas"/>
+          <w:sz w:val="19"/>
+          <w:szCs w:val="19"/>
+          <w:shd w:fill="E2EEF2" w:val="clear"/>
+        </w:rPr>
+        <w:t xml:space="preserve">https://github.com/kerware</w:t>
+      </w:r>
+      <w:r>
+        <w:t xml:space="preserve">,
+</w:t>
+      </w:r>
+      <w:r>
+        <w:rPr>
+          <w:rFonts w:ascii="Consolas" w:cs="Consolas" w:eastAsia="Consolas" w:hAnsi="Consolas"/>
+          <w:sz w:val="19"/>
+          <w:szCs w:val="19"/>
+          <w:shd w:fill="E2EEF2" w:val="clear"/>
+        </w:rPr>
+        <w:t xml:space="preserve">git@gitlab.example.org:qa</w:t>
+      </w:r>
+      <w:r>
+        <w:t xml:space="preserve">) ;</w:t>
+      </w:r>
+    </w:p>
+    <w:p>
+      <w:pPr>
+        <w:pStyle w:val="ListParagraph"/>
+        <w:numPr>
+          <w:ilvl w:val="0"/>
+          <w:numId w:val="2"/>
+        </w:numPr>
+      </w:pPr>
+      <w:r>
+        <w:t xml:space="preserve">on y déclare ses projets (</w:t>
+      </w:r>
+      <w:r>
+        <w:rPr>
+          <w:rFonts w:ascii="Consolas" w:cs="Consolas" w:eastAsia="Consolas" w:hAnsi="Consolas"/>
+          <w:sz w:val="19"/>
+          <w:szCs w:val="19"/>
+          <w:shd w:fill="E2EEF2" w:val="clear"/>
+        </w:rPr>
+        <w:t xml:space="preserve">saucedemo-e2e</w:t>
+      </w:r>
+      <w:r>
+        <w:t xml:space="preserve">), avec leur branche par défaut ;</w:t>
+      </w:r>
+    </w:p>
+    <w:p>
+      <w:pPr>
+        <w:pStyle w:val="ListParagraph"/>
+        <w:numPr>
+          <w:ilvl w:val="0"/>
+          <w:numId w:val="2"/>
+        </w:numPr>
+      </w:pPr>
+      <w:r>
+        <w:t xml:space="preserve">les fiches de tests automatisés proposent ces projets.</w:t>
+      </w:r>
+    </w:p>
+    <w:p>
+      <w:r>
+        <w:t xml:space="preserve">Authentification d'un dépôt privé :</w:t>
+      </w:r>
     </w:p>
     <w:tbl>
       <w:tblPr>
@@ -9180,7 +9275,7 @@
                 <w:b/>
                 <w:bCs/>
               </w:rPr>
-              <w:t xml:space="preserve">Flux</w:t>
+              <w:t xml:space="preserve">Mode</w:t>
             </w:r>
           </w:p>
         </w:tc>
@@ -9200,7 +9295,7 @@
                 <w:b/>
                 <w:bCs/>
               </w:rPr>
-              <w:t xml:space="preserve">De → vers</w:t>
+              <w:t xml:space="preserve">À saisir</w:t>
             </w:r>
           </w:p>
         </w:tc>
@@ -9220,7 +9315,7 @@
                 <w:b/>
                 <w:bCs/>
               </w:rPr>
-              <w:t xml:space="preserve">Port</w:t>
+              <w:t xml:space="preserve">Clone par le serveur d'exécution</w:t>
             </w:r>
           </w:p>
         </w:tc>
@@ -9240,37 +9335,43 @@
           </w:tcPr>
           <w:p>
             <w:r>
-              <w:t xml:space="preserve">Navigateurs des utilisateurs</w:t>
-            </w:r>
-          </w:p>
-        </w:tc>
-        <w:tc>
-          <w:tcPr>
-            <w:tcMar>
-              <w:top w:type="dxa" w:w="60"/>
-              <w:left w:type="dxa" w:w="100"/>
-              <w:bottom w:type="dxa" w:w="60"/>
-              <w:right w:type="dxa" w:w="100"/>
-            </w:tcMar>
-          </w:tcPr>
-          <w:p>
-            <w:r>
-              <w:t xml:space="preserve">postes → TraceAgile</w:t>
-            </w:r>
-          </w:p>
-        </w:tc>
-        <w:tc>
-          <w:tcPr>
-            <w:tcMar>
-              <w:top w:type="dxa" w:w="60"/>
-              <w:left w:type="dxa" w:w="100"/>
-              <w:bottom w:type="dxa" w:w="60"/>
-              <w:right w:type="dxa" w:w="100"/>
-            </w:tcMar>
-          </w:tcPr>
-          <w:p>
-            <w:r>
-              <w:t xml:space="preserve">8085 (ou 443 derrière un proxy)</w:t>
+              <w:t xml:space="preserve">Public</w:t>
+            </w:r>
+          </w:p>
+        </w:tc>
+        <w:tc>
+          <w:tcPr>
+            <w:tcMar>
+              <w:top w:type="dxa" w:w="60"/>
+              <w:left w:type="dxa" w:w="100"/>
+              <w:bottom w:type="dxa" w:w="60"/>
+              <w:right w:type="dxa" w:w="100"/>
+            </w:tcMar>
+          </w:tcPr>
+          <w:p>
+            <w:r>
+              <w:t xml:space="preserve">rien</w:t>
+            </w:r>
+          </w:p>
+        </w:tc>
+        <w:tc>
+          <w:tcPr>
+            <w:tcMar>
+              <w:top w:type="dxa" w:w="60"/>
+              <w:left w:type="dxa" w:w="100"/>
+              <w:bottom w:type="dxa" w:w="60"/>
+              <w:right w:type="dxa" w:w="100"/>
+            </w:tcMar>
+          </w:tcPr>
+          <w:p>
+            <w:r>
+              <w:rPr>
+                <w:rFonts w:ascii="Consolas" w:cs="Consolas" w:eastAsia="Consolas" w:hAnsi="Consolas"/>
+                <w:sz w:val="19"/>
+                <w:szCs w:val="19"/>
+                <w:shd w:fill="E2EEF2" w:val="clear"/>
+              </w:rPr>
+              <w:t xml:space="preserve">https://…/projet</w:t>
             </w:r>
           </w:p>
         </w:tc>
@@ -9290,49 +9391,43 @@
           </w:tcPr>
           <w:p>
             <w:r>
-              <w:t xml:space="preserve">Connexion à la base</w:t>
-            </w:r>
-          </w:p>
-        </w:tc>
-        <w:tc>
-          <w:tcPr>
-            <w:tcMar>
-              <w:top w:type="dxa" w:w="60"/>
-              <w:left w:type="dxa" w:w="100"/>
-              <w:bottom w:type="dxa" w:w="60"/>
-              <w:right w:type="dxa" w:w="100"/>
-            </w:tcMar>
-          </w:tcPr>
-          <w:p>
-            <w:r>
-              <w:t xml:space="preserve">TraceAgile → PostgreSQL</w:t>
-            </w:r>
-          </w:p>
-        </w:tc>
-        <w:tc>
-          <w:tcPr>
-            <w:tcMar>
-              <w:top w:type="dxa" w:w="60"/>
-              <w:left w:type="dxa" w:w="100"/>
-              <w:bottom w:type="dxa" w:w="60"/>
-              <w:right w:type="dxa" w:w="100"/>
-            </w:tcMar>
-          </w:tcPr>
-          <w:p>
-            <w:r>
-              <w:t xml:space="preserve">5432 (interne à Docker avec </w:t>
-            </w:r>
-            <w:r>
-              <w:rPr>
-                <w:rFonts w:ascii="Consolas" w:cs="Consolas" w:eastAsia="Consolas" w:hAnsi="Consolas"/>
-                <w:sz w:val="19"/>
-                <w:szCs w:val="19"/>
-                <w:shd w:fill="E2EEF2" w:val="clear"/>
-              </w:rPr>
-              <w:t xml:space="preserve">base-locale</w:t>
-            </w:r>
-            <w:r>
-              <w:t xml:space="preserve">)</w:t>
+              <w:t xml:space="preserve">Jeton d'accès</w:t>
+            </w:r>
+          </w:p>
+        </w:tc>
+        <w:tc>
+          <w:tcPr>
+            <w:tcMar>
+              <w:top w:type="dxa" w:w="60"/>
+              <w:left w:type="dxa" w:w="100"/>
+              <w:bottom w:type="dxa" w:w="60"/>
+              <w:right w:type="dxa" w:w="100"/>
+            </w:tcMar>
+          </w:tcPr>
+          <w:p>
+            <w:r>
+              <w:t xml:space="preserve">jeton personnel (lecture des dépôts) ; utilisateur facultatif sur GitHub</w:t>
+            </w:r>
+          </w:p>
+        </w:tc>
+        <w:tc>
+          <w:tcPr>
+            <w:tcMar>
+              <w:top w:type="dxa" w:w="60"/>
+              <w:left w:type="dxa" w:w="100"/>
+              <w:bottom w:type="dxa" w:w="60"/>
+              <w:right w:type="dxa" w:w="100"/>
+            </w:tcMar>
+          </w:tcPr>
+          <w:p>
+            <w:r>
+              <w:rPr>
+                <w:rFonts w:ascii="Consolas" w:cs="Consolas" w:eastAsia="Consolas" w:hAnsi="Consolas"/>
+                <w:sz w:val="19"/>
+                <w:szCs w:val="19"/>
+                <w:shd w:fill="E2EEF2" w:val="clear"/>
+              </w:rPr>
+              <w:t xml:space="preserve">https://utilisateur:jeton@…/projet</w:t>
             </w:r>
           </w:p>
         </w:tc>
@@ -9352,199 +9447,46 @@
           </w:tcPr>
           <w:p>
             <w:r>
-              <w:t xml:space="preserve">Jobs, santé, artefacts</w:t>
-            </w:r>
-          </w:p>
-        </w:tc>
-        <w:tc>
-          <w:tcPr>
-            <w:tcMar>
-              <w:top w:type="dxa" w:w="60"/>
-              <w:left w:type="dxa" w:w="100"/>
-              <w:bottom w:type="dxa" w:w="60"/>
-              <w:right w:type="dxa" w:w="100"/>
-            </w:tcMar>
-          </w:tcPr>
-          <w:p>
-            <w:r>
-              <w:t xml:space="preserve">TraceAgile → serveur d'exécution</w:t>
-            </w:r>
-          </w:p>
-        </w:tc>
-        <w:tc>
-          <w:tcPr>
-            <w:tcMar>
-              <w:top w:type="dxa" w:w="60"/>
-              <w:left w:type="dxa" w:w="100"/>
-              <w:bottom w:type="dxa" w:w="60"/>
-              <w:right w:type="dxa" w:w="100"/>
-            </w:tcMar>
-          </w:tcPr>
-          <w:p>
-            <w:r>
-              <w:t xml:space="preserve">8091</w:t>
-            </w:r>
-          </w:p>
-        </w:tc>
-      </w:tr>
-      <w:tr>
-        <w:trPr>
-          <w:cantSplit/>
-        </w:trPr>
-        <w:tc>
-          <w:tcPr>
-            <w:tcMar>
-              <w:top w:type="dxa" w:w="60"/>
-              <w:left w:type="dxa" w:w="100"/>
-              <w:bottom w:type="dxa" w:w="60"/>
-              <w:right w:type="dxa" w:w="100"/>
-            </w:tcMar>
-          </w:tcPr>
-          <w:p>
-            <w:r>
-              <w:t xml:space="preserve">Webhooks de résultats</w:t>
-            </w:r>
-          </w:p>
-        </w:tc>
-        <w:tc>
-          <w:tcPr>
-            <w:tcMar>
-              <w:top w:type="dxa" w:w="60"/>
-              <w:left w:type="dxa" w:w="100"/>
-              <w:bottom w:type="dxa" w:w="60"/>
-              <w:right w:type="dxa" w:w="100"/>
-            </w:tcMar>
-          </w:tcPr>
-          <w:p>
-            <w:r>
-              <w:t xml:space="preserve">serveur d'exécution → TraceAgile</w:t>
-            </w:r>
-          </w:p>
-        </w:tc>
-        <w:tc>
-          <w:tcPr>
-            <w:tcMar>
-              <w:top w:type="dxa" w:w="60"/>
-              <w:left w:type="dxa" w:w="100"/>
-              <w:bottom w:type="dxa" w:w="60"/>
-              <w:right w:type="dxa" w:w="100"/>
-            </w:tcMar>
-          </w:tcPr>
-          <w:p>
-            <w:r>
-              <w:t xml:space="preserve">8085 (</w:t>
-            </w:r>
-            <w:r>
-              <w:rPr>
-                <w:rFonts w:ascii="Consolas" w:cs="Consolas" w:eastAsia="Consolas" w:hAnsi="Consolas"/>
-                <w:sz w:val="19"/>
-                <w:szCs w:val="19"/>
-                <w:shd w:fill="E2EEF2" w:val="clear"/>
-              </w:rPr>
-              <w:t xml:space="preserve">TRACEAGILE_CALLBACK_URL</w:t>
-            </w:r>
-            <w:r>
-              <w:t xml:space="preserve">)</w:t>
-            </w:r>
-          </w:p>
-        </w:tc>
-      </w:tr>
-      <w:tr>
-        <w:trPr>
-          <w:cantSplit/>
-        </w:trPr>
-        <w:tc>
-          <w:tcPr>
-            <w:tcMar>
-              <w:top w:type="dxa" w:w="60"/>
-              <w:left w:type="dxa" w:w="100"/>
-              <w:bottom w:type="dxa" w:w="60"/>
-              <w:right w:type="dxa" w:w="100"/>
-            </w:tcMar>
-          </w:tcPr>
-          <w:p>
-            <w:r>
-              <w:t xml:space="preserve">Interface du serveur d'exécution</w:t>
-            </w:r>
-          </w:p>
-        </w:tc>
-        <w:tc>
-          <w:tcPr>
-            <w:tcMar>
-              <w:top w:type="dxa" w:w="60"/>
-              <w:left w:type="dxa" w:w="100"/>
-              <w:bottom w:type="dxa" w:w="60"/>
-              <w:right w:type="dxa" w:w="100"/>
-            </w:tcMar>
-          </w:tcPr>
-          <w:p>
-            <w:r>
-              <w:t xml:space="preserve">postes des administrateurs → serveur d'exécution</w:t>
-            </w:r>
-          </w:p>
-        </w:tc>
-        <w:tc>
-          <w:tcPr>
-            <w:tcMar>
-              <w:top w:type="dxa" w:w="60"/>
-              <w:left w:type="dxa" w:w="100"/>
-              <w:bottom w:type="dxa" w:w="60"/>
-              <w:right w:type="dxa" w:w="100"/>
-            </w:tcMar>
-          </w:tcPr>
-          <w:p>
-            <w:r>
-              <w:t xml:space="preserve">8091</w:t>
-            </w:r>
-          </w:p>
-        </w:tc>
-      </w:tr>
-      <w:tr>
-        <w:trPr>
-          <w:cantSplit/>
-        </w:trPr>
-        <w:tc>
-          <w:tcPr>
-            <w:tcMar>
-              <w:top w:type="dxa" w:w="60"/>
-              <w:left w:type="dxa" w:w="100"/>
-              <w:bottom w:type="dxa" w:w="60"/>
-              <w:right w:type="dxa" w:w="100"/>
-            </w:tcMar>
-          </w:tcPr>
-          <w:p>
-            <w:r>
-              <w:t xml:space="preserve">Clonage des dépôts de tests</w:t>
-            </w:r>
-          </w:p>
-        </w:tc>
-        <w:tc>
-          <w:tcPr>
-            <w:tcMar>
-              <w:top w:type="dxa" w:w="60"/>
-              <w:left w:type="dxa" w:w="100"/>
-              <w:bottom w:type="dxa" w:w="60"/>
-              <w:right w:type="dxa" w:w="100"/>
-            </w:tcMar>
-          </w:tcPr>
-          <w:p>
-            <w:r>
-              <w:t xml:space="preserve">serveur d'exécution → serveur Git</w:t>
-            </w:r>
-          </w:p>
-        </w:tc>
-        <w:tc>
-          <w:tcPr>
-            <w:tcMar>
-              <w:top w:type="dxa" w:w="60"/>
-              <w:left w:type="dxa" w:w="100"/>
-              <w:bottom w:type="dxa" w:w="60"/>
-              <w:right w:type="dxa" w:w="100"/>
-            </w:tcMar>
-          </w:tcPr>
-          <w:p>
-            <w:r>
-              <w:t xml:space="preserve">443 / 22</w:t>
+              <w:t xml:space="preserve">Clé SSH</w:t>
+            </w:r>
+          </w:p>
+        </w:tc>
+        <w:tc>
+          <w:tcPr>
+            <w:tcMar>
+              <w:top w:type="dxa" w:w="60"/>
+              <w:left w:type="dxa" w:w="100"/>
+              <w:bottom w:type="dxa" w:w="60"/>
+              <w:right w:type="dxa" w:w="100"/>
+            </w:tcMar>
+          </w:tcPr>
+          <w:p>
+            <w:r>
+              <w:t xml:space="preserve">clé privée OpenSSH, sans phrase de passe ; la clé publique est déclarée sur le dépôt (clé de déploiement)</w:t>
+            </w:r>
+          </w:p>
+        </w:tc>
+        <w:tc>
+          <w:tcPr>
+            <w:tcMar>
+              <w:top w:type="dxa" w:w="60"/>
+              <w:left w:type="dxa" w:w="100"/>
+              <w:bottom w:type="dxa" w:w="60"/>
+              <w:right w:type="dxa" w:w="100"/>
+            </w:tcMar>
+          </w:tcPr>
+          <w:p>
+            <w:r>
+              <w:rPr>
+                <w:rFonts w:ascii="Consolas" w:cs="Consolas" w:eastAsia="Consolas" w:hAnsi="Consolas"/>
+                <w:sz w:val="19"/>
+                <w:szCs w:val="19"/>
+                <w:shd w:fill="E2EEF2" w:val="clear"/>
+              </w:rPr>
+              <w:t xml:space="preserve">git@hôte:compte/projet.git</w:t>
+            </w:r>
+            <w:r>
+              <w:t xml:space="preserve">, avec une clé écrite pour le seul clone</w:t>
             </w:r>
           </w:p>
         </w:tc>
@@ -9557,52 +9499,91 @@
     </w:p>
     <w:p>
       <w:r>
-        <w:t xml:space="preserve">Sur des machines séparées, ouvrir ces ports en entrée. Sous Windows, par exemple :
-</w:t>
-      </w:r>
-      <w:r>
-        <w:rPr>
-          <w:rFonts w:ascii="Consolas" w:cs="Consolas" w:eastAsia="Consolas" w:hAnsi="Consolas"/>
-          <w:sz w:val="19"/>
-          <w:szCs w:val="19"/>
-          <w:shd w:fill="E2EEF2" w:val="clear"/>
-        </w:rPr>
-        <w:t xml:space="preserve">New-NetFirewallRule -DisplayName TraceAgile -Direction Inbound -Protocol TCP -LocalPort 8085 -Action Allow</w:t>
-      </w:r>
-      <w:r>
-        <w:t xml:space="preserve">,
-et de même pour 8091 sur la machine du serveur.</w:t>
-      </w:r>
-    </w:p>
-    <w:p>
-      <w:r>
-        <w:t xml:space="preserve">Sous Linux, Docker publie les ports des conteneurs en contournant les règles </w:t>
-      </w:r>
-      <w:r>
-        <w:rPr>
-          <w:rFonts w:ascii="Consolas" w:cs="Consolas" w:eastAsia="Consolas" w:hAnsi="Consolas"/>
-          <w:sz w:val="19"/>
-          <w:szCs w:val="19"/>
-          <w:shd w:fill="E2EEF2" w:val="clear"/>
-        </w:rPr>
-        <w:t xml:space="preserve">ufw</w:t>
-      </w:r>
-      <w:r>
-        <w:t xml:space="preserve"> : restreindre
-l'accès au besoin, par exemple en publiant sur une seule interface
-(</w:t>
-      </w:r>
-      <w:r>
-        <w:rPr>
-          <w:rFonts w:ascii="Consolas" w:cs="Consolas" w:eastAsia="Consolas" w:hAnsi="Consolas"/>
-          <w:sz w:val="19"/>
-          <w:szCs w:val="19"/>
-          <w:shd w:fill="E2EEF2" w:val="clear"/>
-        </w:rPr>
-        <w:t xml:space="preserve">"127.0.0.1:${SERVER_PORT:-8085}:8085"</w:t>
-      </w:r>
-      <w:r>
-        <w:t xml:space="preserve"> derrière un proxy local).</w:t>
+        <w:t xml:space="preserve">Le jeton ou la clé est chiffré par TraceAgile (</w:t>
+      </w:r>
+      <w:r>
+        <w:rPr>
+          <w:rFonts w:ascii="Consolas" w:cs="Consolas" w:eastAsia="Consolas" w:hAnsi="Consolas"/>
+          <w:sz w:val="19"/>
+          <w:szCs w:val="19"/>
+          <w:shd w:fill="E2EEF2" w:val="clear"/>
+        </w:rPr>
+        <w:t xml:space="preserve">TRACEAGILE_ENCRYPTION_KEY</w:t>
+      </w:r>
+      <w:r>
+        <w:t xml:space="preserve">), n'est jamais réaffiché,
+et accompagne chaque job envoyé au serveur d'exécution. Le serveur l'utilise pour le clone puis
+l'oublie : il ne l'enregistre pas et le masque dans ses journaux. Servez donc le serveur
+d'exécution en HTTPS dès qu'il est sur une autre machine (§11).</w:t>
+      </w:r>
+    </w:p>
+    <w:p>
+      <w:r>
+        <w:t xml:space="preserve">Un </w:t>
+      </w:r>
+      <w:r>
+        <w:rPr>
+          <w:b/>
+          <w:bCs/>
+        </w:rPr>
+        <w:t xml:space="preserve">dépôt local</w:t>
+      </w:r>
+      <w:r>
+        <w:t xml:space="preserve"> se déclare avec une adresse </w:t>
+      </w:r>
+      <w:r>
+        <w:rPr>
+          <w:rFonts w:ascii="Consolas" w:cs="Consolas" w:eastAsia="Consolas" w:hAnsi="Consolas"/>
+          <w:sz w:val="19"/>
+          <w:szCs w:val="19"/>
+          <w:shd w:fill="E2EEF2" w:val="clear"/>
+        </w:rPr>
+        <w:t xml:space="preserve">file:///dossier</w:t>
+      </w:r>
+      <w:r>
+        <w:t xml:space="preserve">, sans authentification : c'est le
+dossier tel que le voit le serveur d'exécution. En conteneur, il faut le monter dans le conteneur
+(§8). C'est ce que fait la démonstration (</w:t>
+      </w:r>
+      <w:r>
+        <w:rPr>
+          <w:rFonts w:ascii="Consolas" w:cs="Consolas" w:eastAsia="Consolas" w:hAnsi="Consolas"/>
+          <w:sz w:val="19"/>
+          <w:szCs w:val="19"/>
+          <w:shd w:fill="E2EEF2" w:val="clear"/>
+        </w:rPr>
+        <w:t xml:space="preserve">file:///depots</w:t>
+      </w:r>
+      <w:r>
+        <w:t xml:space="preserve">, projet </w:t>
+      </w:r>
+      <w:r>
+        <w:rPr>
+          <w:rFonts w:ascii="Consolas" w:cs="Consolas" w:eastAsia="Consolas" w:hAnsi="Consolas"/>
+          <w:sz w:val="19"/>
+          <w:szCs w:val="19"/>
+          <w:shd w:fill="E2EEF2" w:val="clear"/>
+        </w:rPr>
+        <w:t xml:space="preserve">traceagile</w:t>
+      </w:r>
+      <w:r>
+        <w:t xml:space="preserve">).</w:t>
+      </w:r>
+    </w:p>
+    <w:p>
+      <w:r>
+        <w:t xml:space="preserve">Les identifiants par hôte de la page </w:t>
+      </w:r>
+      <w:r>
+        <w:rPr>
+          <w:b/>
+          <w:bCs/>
+        </w:rPr>
+        <w:t xml:space="preserve">Paramètres</w:t>
+      </w:r>
+      <w:r>
+        <w:t xml:space="preserve"> du serveur d'exécution restent possibles. Ils
+servent aux tests saisis avec une adresse libre.</w:t>
       </w:r>
     </w:p>
     <w:p>
@@ -9611,111 +9592,7 @@
       </w:pPr>
       <w:bookmarkStart w:name="chap_26" w:id="1"/>
       <w:r>
-        <w:t xml:space="preserve">11. HTTPS et proxy inverse</w:t>
-      </w:r>
-      <w:bookmarkEnd w:id="1"/>
-    </w:p>
-    <w:p>
-      <w:r>
-        <w:t xml:space="preserve">En production, placer TraceAgile derrière un proxy TLS (nginx, Apache, IIS ARR, Traefik) et régler
-</w:t>
-      </w:r>
-      <w:r>
-        <w:rPr>
-          <w:rFonts w:ascii="Consolas" w:cs="Consolas" w:eastAsia="Consolas" w:hAnsi="Consolas"/>
-          <w:sz w:val="19"/>
-          <w:szCs w:val="19"/>
-          <w:shd w:fill="E2EEF2" w:val="clear"/>
-        </w:rPr>
-        <w:t xml:space="preserve">TRACEAGILE_COOKIE_SECURE=true</w:t>
-      </w:r>
-      <w:r>
-        <w:t xml:space="preserve">. Le suivi des runs en direct utilise des flux SSE : désactiver la
-mise en mémoire tampon pour </w:t>
-      </w:r>
-      <w:r>
-        <w:rPr>
-          <w:rFonts w:ascii="Consolas" w:cs="Consolas" w:eastAsia="Consolas" w:hAnsi="Consolas"/>
-          <w:sz w:val="19"/>
-          <w:szCs w:val="19"/>
-          <w:shd w:fill="E2EEF2" w:val="clear"/>
-        </w:rPr>
-        <w:t xml:space="preserve">/api/</w:t>
-      </w:r>
-      <w:r>
-        <w:t xml:space="preserve">. Exemple nginx :</w:t>
-      </w:r>
-    </w:p>
-    <w:p>
-      <w:pPr>
-        <w:pStyle w:val="Code"/>
-      </w:pPr>
-      <w:r>
-        <w:t xml:space="preserve">location / {</w:t>
-      </w:r>
-      <w:r>
-        <w:br/>
-        <w:t xml:space="preserve">    proxy_pass http://127.0.0.1:8085;</w:t>
-      </w:r>
-      <w:r>
-        <w:br/>
-        <w:t xml:space="preserve">    proxy_set_header Host $host;</w:t>
-      </w:r>
-      <w:r>
-        <w:br/>
-        <w:t xml:space="preserve">    proxy_set_header X-Forwarded-Proto $scheme;</w:t>
-      </w:r>
-      <w:r>
-        <w:br/>
-        <w:t xml:space="preserve">    proxy_buffering off;</w:t>
-      </w:r>
-      <w:r>
-        <w:br/>
-        <w:t xml:space="preserve">    proxy_read_timeout 1h;</w:t>
-      </w:r>
-      <w:r>
-        <w:br/>
-        <w:t xml:space="preserve">    client_max_body_size 20m;</w:t>
-      </w:r>
-      <w:r>
-        <w:br/>
-        <w:t xml:space="preserve">}</w:t>
-      </w:r>
-    </w:p>
-    <w:p>
-      <w:r>
-        <w:rPr>
-          <w:rFonts w:ascii="Consolas" w:cs="Consolas" w:eastAsia="Consolas" w:hAnsi="Consolas"/>
-          <w:sz w:val="19"/>
-          <w:szCs w:val="19"/>
-          <w:shd w:fill="E2EEF2" w:val="clear"/>
-        </w:rPr>
-        <w:t xml:space="preserve">TRACEAGILE_CALLBACK_URL</w:t>
-      </w:r>
-      <w:r>
-        <w:t xml:space="preserve"> prend alors l'adresse HTTPS publique. Le serveur d'exécution peut être
-protégé de la même façon ; son adresse dans TraceAgile devient </w:t>
-      </w:r>
-      <w:r>
-        <w:rPr>
-          <w:rFonts w:ascii="Consolas" w:cs="Consolas" w:eastAsia="Consolas" w:hAnsi="Consolas"/>
-          <w:sz w:val="19"/>
-          <w:szCs w:val="19"/>
-          <w:shd w:fill="E2EEF2" w:val="clear"/>
-        </w:rPr>
-        <w:t xml:space="preserve">https://…</w:t>
-      </w:r>
-      <w:r>
-        <w:t xml:space="preserve">.</w:t>
-      </w:r>
-    </w:p>
-    <w:p>
-      <w:pPr>
-        <w:pStyle w:val="Heading1"/>
-      </w:pPr>
-      <w:bookmarkStart w:name="chap_27" w:id="1"/>
-      <w:r>
-        <w:t xml:space="preserve">12. Sauvegarde, mise à jour, désinstallation</w:t>
+        <w:t xml:space="preserve">10. Réseau et pare-feu</w:t>
       </w:r>
       <w:bookmarkEnd w:id="1"/>
     </w:p>
@@ -9750,25 +9627,13 @@
               <w:right w:type="dxa" w:w="100"/>
             </w:tcMar>
           </w:tcPr>
-          <w:p/>
-        </w:tc>
-        <w:tc>
-          <w:tcPr>
-            <w:shd w:fill="E2EEF2" w:val="clear"/>
-            <w:tcMar>
-              <w:top w:type="dxa" w:w="60"/>
-              <w:left w:type="dxa" w:w="100"/>
-              <w:bottom w:type="dxa" w:w="60"/>
-              <w:right w:type="dxa" w:w="100"/>
-            </w:tcMar>
-          </w:tcPr>
           <w:p>
             <w:r>
               <w:rPr>
                 <w:b/>
                 <w:bCs/>
               </w:rPr>
-              <w:t xml:space="preserve">Hors Docker</w:t>
+              <w:t xml:space="preserve">Flux</w:t>
             </w:r>
           </w:p>
         </w:tc>
@@ -9788,7 +9653,27 @@
                 <w:b/>
                 <w:bCs/>
               </w:rPr>
-              <w:t xml:space="preserve">En conteneur</w:t>
+              <w:t xml:space="preserve">De → vers</w:t>
+            </w:r>
+          </w:p>
+        </w:tc>
+        <w:tc>
+          <w:tcPr>
+            <w:shd w:fill="E2EEF2" w:val="clear"/>
+            <w:tcMar>
+              <w:top w:type="dxa" w:w="60"/>
+              <w:left w:type="dxa" w:w="100"/>
+              <w:bottom w:type="dxa" w:w="60"/>
+              <w:right w:type="dxa" w:w="100"/>
+            </w:tcMar>
+          </w:tcPr>
+          <w:p>
+            <w:r>
+              <w:rPr>
+                <w:b/>
+                <w:bCs/>
+              </w:rPr>
+              <w:t xml:space="preserve">Port</w:t>
             </w:r>
           </w:p>
         </w:tc>
@@ -9808,91 +9693,37 @@
           </w:tcPr>
           <w:p>
             <w:r>
-              <w:t xml:space="preserve">Sauvegarder TraceAgile</w:t>
-            </w:r>
-          </w:p>
-        </w:tc>
-        <w:tc>
-          <w:tcPr>
-            <w:tcMar>
-              <w:top w:type="dxa" w:w="60"/>
-              <w:left w:type="dxa" w:w="100"/>
-              <w:bottom w:type="dxa" w:w="60"/>
-              <w:right w:type="dxa" w:w="100"/>
-            </w:tcMar>
-          </w:tcPr>
-          <w:p>
-            <w:r>
-              <w:t xml:space="preserve">la base (</w:t>
-            </w:r>
-            <w:r>
-              <w:rPr>
-                <w:rFonts w:ascii="Consolas" w:cs="Consolas" w:eastAsia="Consolas" w:hAnsi="Consolas"/>
-                <w:sz w:val="19"/>
-                <w:szCs w:val="19"/>
-                <w:shd w:fill="E2EEF2" w:val="clear"/>
-              </w:rPr>
-              <w:t xml:space="preserve">pg_dump -Fc -d traceagile &gt; traceagile.dump</w:t>
-            </w:r>
-            <w:r>
-              <w:t xml:space="preserve">) et le dossier </w:t>
-            </w:r>
-            <w:r>
-              <w:rPr>
-                <w:rFonts w:ascii="Consolas" w:cs="Consolas" w:eastAsia="Consolas" w:hAnsi="Consolas"/>
-                <w:sz w:val="19"/>
-                <w:szCs w:val="19"/>
-                <w:shd w:fill="E2EEF2" w:val="clear"/>
-              </w:rPr>
-              <w:t xml:space="preserve">TRACEAGILE_ATTACHMENTS_DIR</w:t>
-            </w:r>
-          </w:p>
-        </w:tc>
-        <w:tc>
-          <w:tcPr>
-            <w:tcMar>
-              <w:top w:type="dxa" w:w="60"/>
-              <w:left w:type="dxa" w:w="100"/>
-              <w:bottom w:type="dxa" w:w="60"/>
-              <w:right w:type="dxa" w:w="100"/>
-            </w:tcMar>
-          </w:tcPr>
-          <w:p>
-            <w:r>
-              <w:t xml:space="preserve">la base (avec </w:t>
-            </w:r>
-            <w:r>
-              <w:rPr>
-                <w:rFonts w:ascii="Consolas" w:cs="Consolas" w:eastAsia="Consolas" w:hAnsi="Consolas"/>
-                <w:sz w:val="19"/>
-                <w:szCs w:val="19"/>
-                <w:shd w:fill="E2EEF2" w:val="clear"/>
-              </w:rPr>
-              <w:t xml:space="preserve">base-locale</w:t>
-            </w:r>
-            <w:r>
-              <w:t xml:space="preserve"> : </w:t>
-            </w:r>
-            <w:r>
-              <w:rPr>
-                <w:rFonts w:ascii="Consolas" w:cs="Consolas" w:eastAsia="Consolas" w:hAnsi="Consolas"/>
-                <w:sz w:val="19"/>
-                <w:szCs w:val="19"/>
-                <w:shd w:fill="E2EEF2" w:val="clear"/>
-              </w:rPr>
-              <w:t xml:space="preserve">docker compose exec -T postgres pg_dump -Fc -U traceagile traceagile &gt; traceagile.dump</w:t>
-            </w:r>
-            <w:r>
-              <w:t xml:space="preserve">) et le volume </w:t>
-            </w:r>
-            <w:r>
-              <w:rPr>
-                <w:rFonts w:ascii="Consolas" w:cs="Consolas" w:eastAsia="Consolas" w:hAnsi="Consolas"/>
-                <w:sz w:val="19"/>
-                <w:szCs w:val="19"/>
-                <w:shd w:fill="E2EEF2" w:val="clear"/>
-              </w:rPr>
-              <w:t xml:space="preserve">pieces-jointes</w:t>
+              <w:t xml:space="preserve">Navigateurs des utilisateurs</w:t>
+            </w:r>
+          </w:p>
+        </w:tc>
+        <w:tc>
+          <w:tcPr>
+            <w:tcMar>
+              <w:top w:type="dxa" w:w="60"/>
+              <w:left w:type="dxa" w:w="100"/>
+              <w:bottom w:type="dxa" w:w="60"/>
+              <w:right w:type="dxa" w:w="100"/>
+            </w:tcMar>
+          </w:tcPr>
+          <w:p>
+            <w:r>
+              <w:t xml:space="preserve">postes → TraceAgile</w:t>
+            </w:r>
+          </w:p>
+        </w:tc>
+        <w:tc>
+          <w:tcPr>
+            <w:tcMar>
+              <w:top w:type="dxa" w:w="60"/>
+              <w:left w:type="dxa" w:w="100"/>
+              <w:bottom w:type="dxa" w:w="60"/>
+              <w:right w:type="dxa" w:w="100"/>
+            </w:tcMar>
+          </w:tcPr>
+          <w:p>
+            <w:r>
+              <w:t xml:space="preserve">8085 (ou 443 derrière un proxy)</w:t>
             </w:r>
           </w:p>
         </w:tc>
@@ -9912,55 +9743,49 @@
           </w:tcPr>
           <w:p>
             <w:r>
-              <w:t xml:space="preserve">Sauvegarder le serveur d'exécution</w:t>
-            </w:r>
-          </w:p>
-        </w:tc>
-        <w:tc>
-          <w:tcPr>
-            <w:tcMar>
-              <w:top w:type="dxa" w:w="60"/>
-              <w:left w:type="dxa" w:w="100"/>
-              <w:bottom w:type="dxa" w:w="60"/>
-              <w:right w:type="dxa" w:w="100"/>
-            </w:tcMar>
-          </w:tcPr>
-          <w:p>
-            <w:r>
-              <w:rPr>
-                <w:rFonts w:ascii="Consolas" w:cs="Consolas" w:eastAsia="Consolas" w:hAnsi="Consolas"/>
-                <w:sz w:val="19"/>
-                <w:szCs w:val="19"/>
-                <w:shd w:fill="E2EEF2" w:val="clear"/>
-              </w:rPr>
-              <w:t xml:space="preserve">EXECUTION_SERVER_DATA_DIR</w:t>
-            </w:r>
-            <w:r>
-              <w:t xml:space="preserve"> (jetons, jobs) ; les outils se réinstallent</w:t>
-            </w:r>
-          </w:p>
-        </w:tc>
-        <w:tc>
-          <w:tcPr>
-            <w:tcMar>
-              <w:top w:type="dxa" w:w="60"/>
-              <w:left w:type="dxa" w:w="100"/>
-              <w:bottom w:type="dxa" w:w="60"/>
-              <w:right w:type="dxa" w:w="100"/>
-            </w:tcMar>
-          </w:tcPr>
-          <w:p>
-            <w:r>
-              <w:t xml:space="preserve">le volume </w:t>
-            </w:r>
-            <w:r>
-              <w:rPr>
-                <w:rFonts w:ascii="Consolas" w:cs="Consolas" w:eastAsia="Consolas" w:hAnsi="Consolas"/>
-                <w:sz w:val="19"/>
-                <w:szCs w:val="19"/>
-                <w:shd w:fill="E2EEF2" w:val="clear"/>
-              </w:rPr>
-              <w:t xml:space="preserve">donnees</w:t>
+              <w:t xml:space="preserve">Connexion à la base</w:t>
+            </w:r>
+          </w:p>
+        </w:tc>
+        <w:tc>
+          <w:tcPr>
+            <w:tcMar>
+              <w:top w:type="dxa" w:w="60"/>
+              <w:left w:type="dxa" w:w="100"/>
+              <w:bottom w:type="dxa" w:w="60"/>
+              <w:right w:type="dxa" w:w="100"/>
+            </w:tcMar>
+          </w:tcPr>
+          <w:p>
+            <w:r>
+              <w:t xml:space="preserve">TraceAgile → PostgreSQL</w:t>
+            </w:r>
+          </w:p>
+        </w:tc>
+        <w:tc>
+          <w:tcPr>
+            <w:tcMar>
+              <w:top w:type="dxa" w:w="60"/>
+              <w:left w:type="dxa" w:w="100"/>
+              <w:bottom w:type="dxa" w:w="60"/>
+              <w:right w:type="dxa" w:w="100"/>
+            </w:tcMar>
+          </w:tcPr>
+          <w:p>
+            <w:r>
+              <w:t xml:space="preserve">5432 (interne à Docker avec </w:t>
+            </w:r>
+            <w:r>
+              <w:rPr>
+                <w:rFonts w:ascii="Consolas" w:cs="Consolas" w:eastAsia="Consolas" w:hAnsi="Consolas"/>
+                <w:sz w:val="19"/>
+                <w:szCs w:val="19"/>
+                <w:shd w:fill="E2EEF2" w:val="clear"/>
+              </w:rPr>
+              <w:t xml:space="preserve">base-locale</w:t>
+            </w:r>
+            <w:r>
+              <w:t xml:space="preserve">)</w:t>
             </w:r>
           </w:p>
         </w:tc>
@@ -9980,46 +9805,37 @@
           </w:tcPr>
           <w:p>
             <w:r>
-              <w:t xml:space="preserve">Mettre à jour</w:t>
-            </w:r>
-          </w:p>
-        </w:tc>
-        <w:tc>
-          <w:tcPr>
-            <w:tcMar>
-              <w:top w:type="dxa" w:w="60"/>
-              <w:left w:type="dxa" w:w="100"/>
-              <w:bottom w:type="dxa" w:w="60"/>
-              <w:right w:type="dxa" w:w="100"/>
-            </w:tcMar>
-          </w:tcPr>
-          <w:p>
-            <w:r>
-              <w:t xml:space="preserve">arrêter le service, remplacer le jar, redémarrer</w:t>
-            </w:r>
-          </w:p>
-        </w:tc>
-        <w:tc>
-          <w:tcPr>
-            <w:tcMar>
-              <w:top w:type="dxa" w:w="60"/>
-              <w:left w:type="dxa" w:w="100"/>
-              <w:bottom w:type="dxa" w:w="60"/>
-              <w:right w:type="dxa" w:w="100"/>
-            </w:tcMar>
-          </w:tcPr>
-          <w:p>
-            <w:r>
-              <w:t xml:space="preserve">remplacer le jar dans le dossier, puis </w:t>
-            </w:r>
-            <w:r>
-              <w:rPr>
-                <w:rFonts w:ascii="Consolas" w:cs="Consolas" w:eastAsia="Consolas" w:hAnsi="Consolas"/>
-                <w:sz w:val="19"/>
-                <w:szCs w:val="19"/>
-                <w:shd w:fill="E2EEF2" w:val="clear"/>
-              </w:rPr>
-              <w:t xml:space="preserve">docker compose up -d --build</w:t>
+              <w:t xml:space="preserve">Jobs, santé, artefacts</w:t>
+            </w:r>
+          </w:p>
+        </w:tc>
+        <w:tc>
+          <w:tcPr>
+            <w:tcMar>
+              <w:top w:type="dxa" w:w="60"/>
+              <w:left w:type="dxa" w:w="100"/>
+              <w:bottom w:type="dxa" w:w="60"/>
+              <w:right w:type="dxa" w:w="100"/>
+            </w:tcMar>
+          </w:tcPr>
+          <w:p>
+            <w:r>
+              <w:t xml:space="preserve">TraceAgile → serveur d'exécution</w:t>
+            </w:r>
+          </w:p>
+        </w:tc>
+        <w:tc>
+          <w:tcPr>
+            <w:tcMar>
+              <w:top w:type="dxa" w:w="60"/>
+              <w:left w:type="dxa" w:w="100"/>
+              <w:bottom w:type="dxa" w:w="60"/>
+              <w:right w:type="dxa" w:w="100"/>
+            </w:tcMar>
+          </w:tcPr>
+          <w:p>
+            <w:r>
+              <w:t xml:space="preserve">8091</w:t>
             </w:r>
           </w:p>
         </w:tc>
@@ -10039,6 +9855,643 @@
           </w:tcPr>
           <w:p>
             <w:r>
+              <w:t xml:space="preserve">Webhooks de résultats</w:t>
+            </w:r>
+          </w:p>
+        </w:tc>
+        <w:tc>
+          <w:tcPr>
+            <w:tcMar>
+              <w:top w:type="dxa" w:w="60"/>
+              <w:left w:type="dxa" w:w="100"/>
+              <w:bottom w:type="dxa" w:w="60"/>
+              <w:right w:type="dxa" w:w="100"/>
+            </w:tcMar>
+          </w:tcPr>
+          <w:p>
+            <w:r>
+              <w:t xml:space="preserve">serveur d'exécution → TraceAgile</w:t>
+            </w:r>
+          </w:p>
+        </w:tc>
+        <w:tc>
+          <w:tcPr>
+            <w:tcMar>
+              <w:top w:type="dxa" w:w="60"/>
+              <w:left w:type="dxa" w:w="100"/>
+              <w:bottom w:type="dxa" w:w="60"/>
+              <w:right w:type="dxa" w:w="100"/>
+            </w:tcMar>
+          </w:tcPr>
+          <w:p>
+            <w:r>
+              <w:t xml:space="preserve">8085 (</w:t>
+            </w:r>
+            <w:r>
+              <w:rPr>
+                <w:rFonts w:ascii="Consolas" w:cs="Consolas" w:eastAsia="Consolas" w:hAnsi="Consolas"/>
+                <w:sz w:val="19"/>
+                <w:szCs w:val="19"/>
+                <w:shd w:fill="E2EEF2" w:val="clear"/>
+              </w:rPr>
+              <w:t xml:space="preserve">TRACEAGILE_CALLBACK_URL</w:t>
+            </w:r>
+            <w:r>
+              <w:t xml:space="preserve">)</w:t>
+            </w:r>
+          </w:p>
+        </w:tc>
+      </w:tr>
+      <w:tr>
+        <w:trPr>
+          <w:cantSplit/>
+        </w:trPr>
+        <w:tc>
+          <w:tcPr>
+            <w:tcMar>
+              <w:top w:type="dxa" w:w="60"/>
+              <w:left w:type="dxa" w:w="100"/>
+              <w:bottom w:type="dxa" w:w="60"/>
+              <w:right w:type="dxa" w:w="100"/>
+            </w:tcMar>
+          </w:tcPr>
+          <w:p>
+            <w:r>
+              <w:t xml:space="preserve">Interface du serveur d'exécution</w:t>
+            </w:r>
+          </w:p>
+        </w:tc>
+        <w:tc>
+          <w:tcPr>
+            <w:tcMar>
+              <w:top w:type="dxa" w:w="60"/>
+              <w:left w:type="dxa" w:w="100"/>
+              <w:bottom w:type="dxa" w:w="60"/>
+              <w:right w:type="dxa" w:w="100"/>
+            </w:tcMar>
+          </w:tcPr>
+          <w:p>
+            <w:r>
+              <w:t xml:space="preserve">postes des administrateurs → serveur d'exécution</w:t>
+            </w:r>
+          </w:p>
+        </w:tc>
+        <w:tc>
+          <w:tcPr>
+            <w:tcMar>
+              <w:top w:type="dxa" w:w="60"/>
+              <w:left w:type="dxa" w:w="100"/>
+              <w:bottom w:type="dxa" w:w="60"/>
+              <w:right w:type="dxa" w:w="100"/>
+            </w:tcMar>
+          </w:tcPr>
+          <w:p>
+            <w:r>
+              <w:t xml:space="preserve">8091</w:t>
+            </w:r>
+          </w:p>
+        </w:tc>
+      </w:tr>
+      <w:tr>
+        <w:trPr>
+          <w:cantSplit/>
+        </w:trPr>
+        <w:tc>
+          <w:tcPr>
+            <w:tcMar>
+              <w:top w:type="dxa" w:w="60"/>
+              <w:left w:type="dxa" w:w="100"/>
+              <w:bottom w:type="dxa" w:w="60"/>
+              <w:right w:type="dxa" w:w="100"/>
+            </w:tcMar>
+          </w:tcPr>
+          <w:p>
+            <w:r>
+              <w:t xml:space="preserve">Clonage des dépôts de tests</w:t>
+            </w:r>
+          </w:p>
+        </w:tc>
+        <w:tc>
+          <w:tcPr>
+            <w:tcMar>
+              <w:top w:type="dxa" w:w="60"/>
+              <w:left w:type="dxa" w:w="100"/>
+              <w:bottom w:type="dxa" w:w="60"/>
+              <w:right w:type="dxa" w:w="100"/>
+            </w:tcMar>
+          </w:tcPr>
+          <w:p>
+            <w:r>
+              <w:t xml:space="preserve">serveur d'exécution → serveur Git</w:t>
+            </w:r>
+          </w:p>
+        </w:tc>
+        <w:tc>
+          <w:tcPr>
+            <w:tcMar>
+              <w:top w:type="dxa" w:w="60"/>
+              <w:left w:type="dxa" w:w="100"/>
+              <w:bottom w:type="dxa" w:w="60"/>
+              <w:right w:type="dxa" w:w="100"/>
+            </w:tcMar>
+          </w:tcPr>
+          <w:p>
+            <w:r>
+              <w:t xml:space="preserve">443 / 22</w:t>
+            </w:r>
+          </w:p>
+        </w:tc>
+      </w:tr>
+    </w:tbl>
+    <w:p>
+      <w:pPr>
+        <w:spacing w:after="120"/>
+      </w:pPr>
+    </w:p>
+    <w:p>
+      <w:r>
+        <w:t xml:space="preserve">Sur des machines séparées, ouvrir ces ports en entrée. Sous Windows, par exemple :
+</w:t>
+      </w:r>
+      <w:r>
+        <w:rPr>
+          <w:rFonts w:ascii="Consolas" w:cs="Consolas" w:eastAsia="Consolas" w:hAnsi="Consolas"/>
+          <w:sz w:val="19"/>
+          <w:szCs w:val="19"/>
+          <w:shd w:fill="E2EEF2" w:val="clear"/>
+        </w:rPr>
+        <w:t xml:space="preserve">New-NetFirewallRule -DisplayName TraceAgile -Direction Inbound -Protocol TCP -LocalPort 8085 -Action Allow</w:t>
+      </w:r>
+      <w:r>
+        <w:t xml:space="preserve">,
+et de même pour 8091 sur la machine du serveur.</w:t>
+      </w:r>
+    </w:p>
+    <w:p>
+      <w:r>
+        <w:t xml:space="preserve">Sous Linux, Docker publie les ports des conteneurs en contournant les règles </w:t>
+      </w:r>
+      <w:r>
+        <w:rPr>
+          <w:rFonts w:ascii="Consolas" w:cs="Consolas" w:eastAsia="Consolas" w:hAnsi="Consolas"/>
+          <w:sz w:val="19"/>
+          <w:szCs w:val="19"/>
+          <w:shd w:fill="E2EEF2" w:val="clear"/>
+        </w:rPr>
+        <w:t xml:space="preserve">ufw</w:t>
+      </w:r>
+      <w:r>
+        <w:t xml:space="preserve"> : restreindre
+l'accès au besoin, par exemple en publiant sur une seule interface
+(</w:t>
+      </w:r>
+      <w:r>
+        <w:rPr>
+          <w:rFonts w:ascii="Consolas" w:cs="Consolas" w:eastAsia="Consolas" w:hAnsi="Consolas"/>
+          <w:sz w:val="19"/>
+          <w:szCs w:val="19"/>
+          <w:shd w:fill="E2EEF2" w:val="clear"/>
+        </w:rPr>
+        <w:t xml:space="preserve">"127.0.0.1:${SERVER_PORT:-8085}:8085"</w:t>
+      </w:r>
+      <w:r>
+        <w:t xml:space="preserve"> derrière un proxy local).</w:t>
+      </w:r>
+    </w:p>
+    <w:p>
+      <w:pPr>
+        <w:pStyle w:val="Heading1"/>
+      </w:pPr>
+      <w:bookmarkStart w:name="chap_27" w:id="1"/>
+      <w:r>
+        <w:t xml:space="preserve">11. HTTPS et proxy inverse</w:t>
+      </w:r>
+      <w:bookmarkEnd w:id="1"/>
+    </w:p>
+    <w:p>
+      <w:r>
+        <w:t xml:space="preserve">En production, placer TraceAgile derrière un proxy TLS (nginx, Apache, IIS ARR, Traefik) et régler
+</w:t>
+      </w:r>
+      <w:r>
+        <w:rPr>
+          <w:rFonts w:ascii="Consolas" w:cs="Consolas" w:eastAsia="Consolas" w:hAnsi="Consolas"/>
+          <w:sz w:val="19"/>
+          <w:szCs w:val="19"/>
+          <w:shd w:fill="E2EEF2" w:val="clear"/>
+        </w:rPr>
+        <w:t xml:space="preserve">TRACEAGILE_COOKIE_SECURE=true</w:t>
+      </w:r>
+      <w:r>
+        <w:t xml:space="preserve">. Le suivi des runs en direct utilise des flux SSE : désactiver la
+mise en mémoire tampon pour </w:t>
+      </w:r>
+      <w:r>
+        <w:rPr>
+          <w:rFonts w:ascii="Consolas" w:cs="Consolas" w:eastAsia="Consolas" w:hAnsi="Consolas"/>
+          <w:sz w:val="19"/>
+          <w:szCs w:val="19"/>
+          <w:shd w:fill="E2EEF2" w:val="clear"/>
+        </w:rPr>
+        <w:t xml:space="preserve">/api/</w:t>
+      </w:r>
+      <w:r>
+        <w:t xml:space="preserve">. Exemple nginx :</w:t>
+      </w:r>
+    </w:p>
+    <w:p>
+      <w:pPr>
+        <w:pStyle w:val="Code"/>
+      </w:pPr>
+      <w:r>
+        <w:t xml:space="preserve">location / {</w:t>
+      </w:r>
+      <w:r>
+        <w:br/>
+        <w:t xml:space="preserve">    proxy_pass http://127.0.0.1:8085;</w:t>
+      </w:r>
+      <w:r>
+        <w:br/>
+        <w:t xml:space="preserve">    proxy_set_header Host $host;</w:t>
+      </w:r>
+      <w:r>
+        <w:br/>
+        <w:t xml:space="preserve">    proxy_set_header X-Forwarded-Proto $scheme;</w:t>
+      </w:r>
+      <w:r>
+        <w:br/>
+        <w:t xml:space="preserve">    proxy_buffering off;</w:t>
+      </w:r>
+      <w:r>
+        <w:br/>
+        <w:t xml:space="preserve">    proxy_read_timeout 1h;</w:t>
+      </w:r>
+      <w:r>
+        <w:br/>
+        <w:t xml:space="preserve">    client_max_body_size 20m;</w:t>
+      </w:r>
+      <w:r>
+        <w:br/>
+        <w:t xml:space="preserve">}</w:t>
+      </w:r>
+    </w:p>
+    <w:p>
+      <w:r>
+        <w:rPr>
+          <w:rFonts w:ascii="Consolas" w:cs="Consolas" w:eastAsia="Consolas" w:hAnsi="Consolas"/>
+          <w:sz w:val="19"/>
+          <w:szCs w:val="19"/>
+          <w:shd w:fill="E2EEF2" w:val="clear"/>
+        </w:rPr>
+        <w:t xml:space="preserve">TRACEAGILE_CALLBACK_URL</w:t>
+      </w:r>
+      <w:r>
+        <w:t xml:space="preserve"> prend alors l'adresse HTTPS publique. Le serveur d'exécution peut être
+protégé de la même façon ; son adresse dans TraceAgile devient </w:t>
+      </w:r>
+      <w:r>
+        <w:rPr>
+          <w:rFonts w:ascii="Consolas" w:cs="Consolas" w:eastAsia="Consolas" w:hAnsi="Consolas"/>
+          <w:sz w:val="19"/>
+          <w:szCs w:val="19"/>
+          <w:shd w:fill="E2EEF2" w:val="clear"/>
+        </w:rPr>
+        <w:t xml:space="preserve">https://…</w:t>
+      </w:r>
+      <w:r>
+        <w:t xml:space="preserve">.</w:t>
+      </w:r>
+    </w:p>
+    <w:p>
+      <w:pPr>
+        <w:pStyle w:val="Heading1"/>
+      </w:pPr>
+      <w:bookmarkStart w:name="chap_28" w:id="1"/>
+      <w:r>
+        <w:t xml:space="preserve">12. Sauvegarde, mise à jour, désinstallation</w:t>
+      </w:r>
+      <w:bookmarkEnd w:id="1"/>
+    </w:p>
+    <w:tbl>
+      <w:tblPr>
+        <w:tblW w:type="pct" w:w="100%"/>
+        <w:tblBorders>
+          <w:top w:val="single" w:color="auto" w:sz="4"/>
+          <w:left w:val="single" w:color="auto" w:sz="4"/>
+          <w:bottom w:val="single" w:color="auto" w:sz="4"/>
+          <w:right w:val="single" w:color="auto" w:sz="4"/>
+          <w:insideH w:val="single" w:color="auto" w:sz="4"/>
+          <w:insideV w:val="single" w:color="auto" w:sz="4"/>
+        </w:tblBorders>
+      </w:tblPr>
+      <w:tblGrid>
+        <w:gridCol w:w="100"/>
+        <w:gridCol w:w="100"/>
+        <w:gridCol w:w="100"/>
+      </w:tblGrid>
+      <w:tr>
+        <w:trPr>
+          <w:tblHeader/>
+        </w:trPr>
+        <w:tc>
+          <w:tcPr>
+            <w:shd w:fill="E2EEF2" w:val="clear"/>
+            <w:tcMar>
+              <w:top w:type="dxa" w:w="60"/>
+              <w:left w:type="dxa" w:w="100"/>
+              <w:bottom w:type="dxa" w:w="60"/>
+              <w:right w:type="dxa" w:w="100"/>
+            </w:tcMar>
+          </w:tcPr>
+          <w:p/>
+        </w:tc>
+        <w:tc>
+          <w:tcPr>
+            <w:shd w:fill="E2EEF2" w:val="clear"/>
+            <w:tcMar>
+              <w:top w:type="dxa" w:w="60"/>
+              <w:left w:type="dxa" w:w="100"/>
+              <w:bottom w:type="dxa" w:w="60"/>
+              <w:right w:type="dxa" w:w="100"/>
+            </w:tcMar>
+          </w:tcPr>
+          <w:p>
+            <w:r>
+              <w:rPr>
+                <w:b/>
+                <w:bCs/>
+              </w:rPr>
+              <w:t xml:space="preserve">Hors Docker</w:t>
+            </w:r>
+          </w:p>
+        </w:tc>
+        <w:tc>
+          <w:tcPr>
+            <w:shd w:fill="E2EEF2" w:val="clear"/>
+            <w:tcMar>
+              <w:top w:type="dxa" w:w="60"/>
+              <w:left w:type="dxa" w:w="100"/>
+              <w:bottom w:type="dxa" w:w="60"/>
+              <w:right w:type="dxa" w:w="100"/>
+            </w:tcMar>
+          </w:tcPr>
+          <w:p>
+            <w:r>
+              <w:rPr>
+                <w:b/>
+                <w:bCs/>
+              </w:rPr>
+              <w:t xml:space="preserve">En conteneur</w:t>
+            </w:r>
+          </w:p>
+        </w:tc>
+      </w:tr>
+      <w:tr>
+        <w:trPr>
+          <w:cantSplit/>
+        </w:trPr>
+        <w:tc>
+          <w:tcPr>
+            <w:tcMar>
+              <w:top w:type="dxa" w:w="60"/>
+              <w:left w:type="dxa" w:w="100"/>
+              <w:bottom w:type="dxa" w:w="60"/>
+              <w:right w:type="dxa" w:w="100"/>
+            </w:tcMar>
+          </w:tcPr>
+          <w:p>
+            <w:r>
+              <w:t xml:space="preserve">Sauvegarder TraceAgile</w:t>
+            </w:r>
+          </w:p>
+        </w:tc>
+        <w:tc>
+          <w:tcPr>
+            <w:tcMar>
+              <w:top w:type="dxa" w:w="60"/>
+              <w:left w:type="dxa" w:w="100"/>
+              <w:bottom w:type="dxa" w:w="60"/>
+              <w:right w:type="dxa" w:w="100"/>
+            </w:tcMar>
+          </w:tcPr>
+          <w:p>
+            <w:r>
+              <w:t xml:space="preserve">la base (</w:t>
+            </w:r>
+            <w:r>
+              <w:rPr>
+                <w:rFonts w:ascii="Consolas" w:cs="Consolas" w:eastAsia="Consolas" w:hAnsi="Consolas"/>
+                <w:sz w:val="19"/>
+                <w:szCs w:val="19"/>
+                <w:shd w:fill="E2EEF2" w:val="clear"/>
+              </w:rPr>
+              <w:t xml:space="preserve">pg_dump -Fc -d traceagile &gt; traceagile.dump</w:t>
+            </w:r>
+            <w:r>
+              <w:t xml:space="preserve">) et le dossier </w:t>
+            </w:r>
+            <w:r>
+              <w:rPr>
+                <w:rFonts w:ascii="Consolas" w:cs="Consolas" w:eastAsia="Consolas" w:hAnsi="Consolas"/>
+                <w:sz w:val="19"/>
+                <w:szCs w:val="19"/>
+                <w:shd w:fill="E2EEF2" w:val="clear"/>
+              </w:rPr>
+              <w:t xml:space="preserve">TRACEAGILE_ATTACHMENTS_DIR</w:t>
+            </w:r>
+          </w:p>
+        </w:tc>
+        <w:tc>
+          <w:tcPr>
+            <w:tcMar>
+              <w:top w:type="dxa" w:w="60"/>
+              <w:left w:type="dxa" w:w="100"/>
+              <w:bottom w:type="dxa" w:w="60"/>
+              <w:right w:type="dxa" w:w="100"/>
+            </w:tcMar>
+          </w:tcPr>
+          <w:p>
+            <w:r>
+              <w:t xml:space="preserve">la base (avec </w:t>
+            </w:r>
+            <w:r>
+              <w:rPr>
+                <w:rFonts w:ascii="Consolas" w:cs="Consolas" w:eastAsia="Consolas" w:hAnsi="Consolas"/>
+                <w:sz w:val="19"/>
+                <w:szCs w:val="19"/>
+                <w:shd w:fill="E2EEF2" w:val="clear"/>
+              </w:rPr>
+              <w:t xml:space="preserve">base-locale</w:t>
+            </w:r>
+            <w:r>
+              <w:t xml:space="preserve"> : </w:t>
+            </w:r>
+            <w:r>
+              <w:rPr>
+                <w:rFonts w:ascii="Consolas" w:cs="Consolas" w:eastAsia="Consolas" w:hAnsi="Consolas"/>
+                <w:sz w:val="19"/>
+                <w:szCs w:val="19"/>
+                <w:shd w:fill="E2EEF2" w:val="clear"/>
+              </w:rPr>
+              <w:t xml:space="preserve">docker compose exec -T postgres pg_dump -Fc -U traceagile traceagile &gt; traceagile.dump</w:t>
+            </w:r>
+            <w:r>
+              <w:t xml:space="preserve">) et le volume </w:t>
+            </w:r>
+            <w:r>
+              <w:rPr>
+                <w:rFonts w:ascii="Consolas" w:cs="Consolas" w:eastAsia="Consolas" w:hAnsi="Consolas"/>
+                <w:sz w:val="19"/>
+                <w:szCs w:val="19"/>
+                <w:shd w:fill="E2EEF2" w:val="clear"/>
+              </w:rPr>
+              <w:t xml:space="preserve">pieces-jointes</w:t>
+            </w:r>
+          </w:p>
+        </w:tc>
+      </w:tr>
+      <w:tr>
+        <w:trPr>
+          <w:cantSplit/>
+        </w:trPr>
+        <w:tc>
+          <w:tcPr>
+            <w:tcMar>
+              <w:top w:type="dxa" w:w="60"/>
+              <w:left w:type="dxa" w:w="100"/>
+              <w:bottom w:type="dxa" w:w="60"/>
+              <w:right w:type="dxa" w:w="100"/>
+            </w:tcMar>
+          </w:tcPr>
+          <w:p>
+            <w:r>
+              <w:t xml:space="preserve">Sauvegarder le serveur d'exécution</w:t>
+            </w:r>
+          </w:p>
+        </w:tc>
+        <w:tc>
+          <w:tcPr>
+            <w:tcMar>
+              <w:top w:type="dxa" w:w="60"/>
+              <w:left w:type="dxa" w:w="100"/>
+              <w:bottom w:type="dxa" w:w="60"/>
+              <w:right w:type="dxa" w:w="100"/>
+            </w:tcMar>
+          </w:tcPr>
+          <w:p>
+            <w:r>
+              <w:rPr>
+                <w:rFonts w:ascii="Consolas" w:cs="Consolas" w:eastAsia="Consolas" w:hAnsi="Consolas"/>
+                <w:sz w:val="19"/>
+                <w:szCs w:val="19"/>
+                <w:shd w:fill="E2EEF2" w:val="clear"/>
+              </w:rPr>
+              <w:t xml:space="preserve">EXECUTION_SERVER_DATA_DIR</w:t>
+            </w:r>
+            <w:r>
+              <w:t xml:space="preserve"> (jetons, jobs) ; les outils se réinstallent</w:t>
+            </w:r>
+          </w:p>
+        </w:tc>
+        <w:tc>
+          <w:tcPr>
+            <w:tcMar>
+              <w:top w:type="dxa" w:w="60"/>
+              <w:left w:type="dxa" w:w="100"/>
+              <w:bottom w:type="dxa" w:w="60"/>
+              <w:right w:type="dxa" w:w="100"/>
+            </w:tcMar>
+          </w:tcPr>
+          <w:p>
+            <w:r>
+              <w:t xml:space="preserve">le volume </w:t>
+            </w:r>
+            <w:r>
+              <w:rPr>
+                <w:rFonts w:ascii="Consolas" w:cs="Consolas" w:eastAsia="Consolas" w:hAnsi="Consolas"/>
+                <w:sz w:val="19"/>
+                <w:szCs w:val="19"/>
+                <w:shd w:fill="E2EEF2" w:val="clear"/>
+              </w:rPr>
+              <w:t xml:space="preserve">donnees</w:t>
+            </w:r>
+          </w:p>
+        </w:tc>
+      </w:tr>
+      <w:tr>
+        <w:trPr>
+          <w:cantSplit/>
+        </w:trPr>
+        <w:tc>
+          <w:tcPr>
+            <w:tcMar>
+              <w:top w:type="dxa" w:w="60"/>
+              <w:left w:type="dxa" w:w="100"/>
+              <w:bottom w:type="dxa" w:w="60"/>
+              <w:right w:type="dxa" w:w="100"/>
+            </w:tcMar>
+          </w:tcPr>
+          <w:p>
+            <w:r>
+              <w:t xml:space="preserve">Mettre à jour</w:t>
+            </w:r>
+          </w:p>
+        </w:tc>
+        <w:tc>
+          <w:tcPr>
+            <w:tcMar>
+              <w:top w:type="dxa" w:w="60"/>
+              <w:left w:type="dxa" w:w="100"/>
+              <w:bottom w:type="dxa" w:w="60"/>
+              <w:right w:type="dxa" w:w="100"/>
+            </w:tcMar>
+          </w:tcPr>
+          <w:p>
+            <w:r>
+              <w:t xml:space="preserve">arrêter le service, remplacer le jar, redémarrer</w:t>
+            </w:r>
+          </w:p>
+        </w:tc>
+        <w:tc>
+          <w:tcPr>
+            <w:tcMar>
+              <w:top w:type="dxa" w:w="60"/>
+              <w:left w:type="dxa" w:w="100"/>
+              <w:bottom w:type="dxa" w:w="60"/>
+              <w:right w:type="dxa" w:w="100"/>
+            </w:tcMar>
+          </w:tcPr>
+          <w:p>
+            <w:r>
+              <w:t xml:space="preserve">remplacer le jar dans le dossier, puis </w:t>
+            </w:r>
+            <w:r>
+              <w:rPr>
+                <w:rFonts w:ascii="Consolas" w:cs="Consolas" w:eastAsia="Consolas" w:hAnsi="Consolas"/>
+                <w:sz w:val="19"/>
+                <w:szCs w:val="19"/>
+                <w:shd w:fill="E2EEF2" w:val="clear"/>
+              </w:rPr>
+              <w:t xml:space="preserve">docker compose up -d --build</w:t>
+            </w:r>
+          </w:p>
+        </w:tc>
+      </w:tr>
+      <w:tr>
+        <w:trPr>
+          <w:cantSplit/>
+        </w:trPr>
+        <w:tc>
+          <w:tcPr>
+            <w:tcMar>
+              <w:top w:type="dxa" w:w="60"/>
+              <w:left w:type="dxa" w:w="100"/>
+              <w:bottom w:type="dxa" w:w="60"/>
+              <w:right w:type="dxa" w:w="100"/>
+            </w:tcMar>
+          </w:tcPr>
+          <w:p>
+            <w:r>
               <w:t xml:space="preserve">Désinstaller</w:t>
             </w:r>
           </w:p>
@@ -10213,7 +10666,7 @@
       <w:pPr>
         <w:pStyle w:val="Heading1"/>
       </w:pPr>
-      <w:bookmarkStart w:name="chap_28" w:id="1"/>
+      <w:bookmarkStart w:name="chap_29" w:id="1"/>
       <w:r>
         <w:t xml:space="preserve">13. Dépannage</w:t>
       </w:r>
@@ -11048,7 +11501,7 @@
       <w:pPr>
         <w:pStyle w:val="Heading1"/>
       </w:pPr>
-      <w:bookmarkStart w:name="chap_29" w:id="1"/>
+      <w:bookmarkStart w:name="chap_30" w:id="1"/>
       <w:r>
         <w:t xml:space="preserve">14. Limites de la démonstration</w:t>
       </w:r>

</xml_diff>